<commit_message>
feat: add date, fix trigger
</commit_message>
<xml_diff>
--- a/public/documents/TEMPLATE_Interoperabilitaetsbewertung.docx
+++ b/public/documents/TEMPLATE_Interoperabilitaetsbewertung.docx
@@ -45,21 +45,7 @@
           <w:rStyle w:val="None"/>
           <w:lang w:val="de-DE"/>
         </w:rPr>
-        <w:t>{{</w:t>
-      </w:r>
-      <w:r>
-        <w:rPr>
-          <w:rStyle w:val="None"/>
-          <w:lang w:val="de-DE"/>
-        </w:rPr>
-        <w:t>CONTENT</w:t>
-      </w:r>
-      <w:r>
-        <w:rPr>
-          <w:rStyle w:val="None"/>
-          <w:lang w:val="de-DE"/>
-        </w:rPr>
-        <w:t>}}</w:t>
+        <w:t>{{CONTENT}}</w:t>
       </w:r>
     </w:p>
     <w:p>
@@ -110,18 +96,15 @@
         </w:rPr>
         <w:t xml:space="preserve">Rufen Sie uns an: {{DS_PHONE}} oder schreiben Sie uns unter: </w:t>
       </w:r>
-      <w:hyperlink r:id="rId2">
-        <w:r>
-          <w:rPr>
-            <w:rStyle w:val="Style7"/>
-            <w:outline w:val="false"/>
-            <w:color w:val="0563C1"/>
-            <w:u w:val="single" w:color="0563C1"/>
-            <w:lang w:val="de-DE"/>
-          </w:rPr>
-          <w:t>{{INTEROPS_EMAIL}}</w:t>
-        </w:r>
-      </w:hyperlink>
+      <w:r>
+        <w:rPr>
+          <w:rStyle w:val="None"/>
+          <w:color w:val="2A6099"/>
+          <w:u w:val="single"/>
+          <w:lang w:val="de-DE"/>
+        </w:rPr>
+        <w:t>{{INTEROPS_EMAIL}}</w:t>
+      </w:r>
       <w:r>
         <w:rPr>
           <w:rStyle w:val="None"/>
@@ -155,12 +138,12 @@
       </w:r>
     </w:p>
     <w:sectPr>
-      <w:headerReference w:type="even" r:id="rId3"/>
-      <w:headerReference w:type="default" r:id="rId4"/>
-      <w:headerReference w:type="first" r:id="rId5"/>
-      <w:footerReference w:type="even" r:id="rId6"/>
-      <w:footerReference w:type="default" r:id="rId7"/>
-      <w:footerReference w:type="first" r:id="rId8"/>
+      <w:headerReference w:type="even" r:id="rId2"/>
+      <w:headerReference w:type="default" r:id="rId3"/>
+      <w:headerReference w:type="first" r:id="rId4"/>
+      <w:footerReference w:type="even" r:id="rId5"/>
+      <w:footerReference w:type="default" r:id="rId6"/>
+      <w:footerReference w:type="first" r:id="rId7"/>
       <w:type w:val="nextPage"/>
       <w:pgSz w:w="11906" w:h="16838"/>
       <w:pgMar w:left="1440" w:right="1440" w:gutter="0" w:header="708" w:top="1440" w:footer="709" w:bottom="1440"/>
@@ -475,10 +458,6 @@
       <w:keepLines w:val="false"/>
       <w:pageBreakBefore w:val="false"/>
       <w:widowControl/>
-      <w:numPr>
-        <w:ilvl w:val="0"/>
-        <w:numId w:val="0"/>
-      </w:numPr>
       <w:suppressAutoHyphens w:val="false"/>
       <w:overflowPunct w:val="false"/>
       <w:bidi w:val="0"/>
@@ -522,10 +501,6 @@
       <w:keepLines w:val="false"/>
       <w:pageBreakBefore w:val="false"/>
       <w:widowControl/>
-      <w:numPr>
-        <w:ilvl w:val="0"/>
-        <w:numId w:val="0"/>
-      </w:numPr>
       <w:suppressAutoHyphens w:val="false"/>
       <w:overflowPunct w:val="false"/>
       <w:bidi w:val="0"/>

</xml_diff>